<commit_message>
Revise data-source wording in current manuscripts and synchronize citation-only archive update
</commit_message>
<xml_diff>
--- a/deliverables/2026-10-23-unified-update/URP_All_Figure_Interpretations_Updated_20261023.docx
+++ b/deliverables/2026-10-23-unified-update/URP_All_Figure_Interpretations_Updated_20261023.docx
@@ -183,7 +183,7 @@
           <w:b w:val="0"/>
           <w:sz w:val="19"/>
         </w:rPr>
-        <w:t xml:space="preserve">Station coordinates and field dimensions follow Wang </w:t>
+        <w:t xml:space="preserve">Station coordinates and field dimensions are based on the reported field observations </w:t>
       </w:r>
       <w:r>
         <w:rPr>
@@ -216,7 +216,7 @@
           <w:b w:val="0"/>
           <w:sz w:val="21"/>
         </w:rPr>
-        <w:t>试验区位于甘肃武威绿洲农业高效用水国家野外科学观测研究站，即中国农业大学石羊河实验站（37°52′N，102°52′E），海拔1581 m，属温带大陆性干旱气候，年平均降水量约164 mm，地下水埋深约40～50 m</w:t>
+        <w:t>本研究采用2019—2022年膜下滴灌玉米既有田间观测资料</w:t>
       </w:r>
       <w:r>
         <w:rPr>
@@ -233,7 +233,7 @@
           <w:b w:val="0"/>
           <w:sz w:val="21"/>
         </w:rPr>
-        <w:t>。膜下滴灌玉米观测区面积为400 m×200 m，种植密度为79 365株·ha⁻¹。地膜宽度1.2 m，相邻地膜间距0.4 m，对应覆盖率75%。图2给出试验站位置和DI观测区尺度。</w:t>
+        <w:t>。观测区位于甘肃武威的中国农业大学石羊河实验站（37°52′N，102°52′E），海拔1581 m，属温带大陆性干旱气候，年平均降水量约164 mm，地下水埋深约40～50 m。膜下滴灌玉米观测区面积为400 m×200 m，种植密度为79 365株·ha⁻¹。地膜宽度1.2 m，相邻地膜间距0.4 m，对应覆盖率75%。图2给出试验站位置和DI观测区尺度。</w:t>
       </w:r>
     </w:p>
     <w:p>
@@ -249,7 +249,7 @@
           <w:b w:val="0"/>
           <w:sz w:val="19"/>
         </w:rPr>
-        <w:t xml:space="preserve">The study was conducted at the Shiyanghe Experimental Station of China Agricultural University, within the national field observation and research station for efficient agricultural water use in the Wuwei oasis (37°52′ N, 102°52′ E; 1581 m above sea level). The temperate continental arid climate has mean annual precipitation of approximately 164 mm, with groundwater at a depth of approximately 40–50 m </w:t>
+        <w:t xml:space="preserve">This study uses existing field observations of film-mulched drip-irrigated maize for 2019–2022 </w:t>
       </w:r>
       <w:r>
         <w:rPr>
@@ -266,7 +266,7 @@
           <w:b w:val="0"/>
           <w:sz w:val="19"/>
         </w:rPr>
-        <w:t>. The DI observation field measured 400 m × 200 m and was planted at 79,365 plants ha⁻¹. Film strips were 1.2 m wide, separated by 0.4 m, giving 75% coverage (Fig. 2).</w:t>
+        <w:t>. The observation site is at the Shiyanghe Experimental Station of China Agricultural University in Wuwei, Gansu (37°52′ N, 102°52′ E; 1581 m above sea level). The temperate continental arid climate has mean annual precipitation of approximately 164 mm, with groundwater at a depth of approximately 40–50 m. The DI observation field measured 400 m × 200 m and was planted at 79,365 plants ha⁻¹. Film strips were 1.2 m wide, separated by 0.4 m, giving 75% coverage (Fig. 2).</w:t>
       </w:r>
     </w:p>
     <w:p>

</xml_diff>